<commit_message>
Fix English HW due dates to match Korean; add Korean blockchain materials
- Schedule: correct English Assignments Due to Tuesday cadence matching
  the Korean table (Session 5 = Ch 0,1,2; Exam 1 = Ch 3,4,6,7; clear Session 7)
- Special Topic 2 (Blockchain): add Korean slides + lesson plans, wire the
  Korean tab to the Korean files (was English-only)

Co-Authored-By: Claude Opus 4.8 (1M context) <noreply@anthropic.com>
</commit_message>
<xml_diff>
--- a/files/special2/english/ST2_Blockchain_notes.docx
+++ b/files/special2/english/ST2_Blockchain_notes.docx
@@ -1810,31 +1810,7 @@
           <w:sz w:val="28"/>
           <w:szCs w:val="28"/>
         </w:rPr>
-        <w:t xml:space="preserve">Before the class starts or </w:t>
-      </w:r>
-      <w:proofErr w:type="gramStart"/>
-      <w:r>
-        <w:rPr>
-          <w:rFonts w:asciiTheme="minorHAnsi" w:hAnsiTheme="minorHAnsi" w:cstheme="minorHAnsi"/>
-          <w:b/>
-          <w:bCs/>
-          <w:color w:val="auto"/>
-          <w:sz w:val="28"/>
-          <w:szCs w:val="28"/>
-        </w:rPr>
-        <w:t>After</w:t>
-      </w:r>
-      <w:proofErr w:type="gramEnd"/>
-      <w:r>
-        <w:rPr>
-          <w:rFonts w:asciiTheme="minorHAnsi" w:hAnsiTheme="minorHAnsi" w:cstheme="minorHAnsi"/>
-          <w:b/>
-          <w:bCs/>
-          <w:color w:val="auto"/>
-          <w:sz w:val="28"/>
-          <w:szCs w:val="28"/>
-        </w:rPr>
-        <w:t xml:space="preserve"> the class</w:t>
+        <w:t>Before the class starts or After the class</w:t>
       </w:r>
       <w:bookmarkEnd w:id="2"/>
     </w:p>
@@ -2000,7 +1976,7 @@
               <w:rPr>
                 <w:noProof/>
               </w:rPr>
-              <w:object w:dxaOrig="1440" w:dyaOrig="1440" w14:anchorId="449E705D">
+              <w:object w:dxaOrig="0" w:dyaOrig="0" w14:anchorId="449E705D">
                 <v:shapetype id="_x0000_t75" coordsize="21600,21600" o:spt="75" o:preferrelative="t" path="m@4@5l@4@11@9@11@9@5xe" filled="f" stroked="f">
                   <v:stroke joinstyle="miter"/>
                   <v:formulas>
@@ -2020,11 +1996,11 @@
                   <v:path o:extrusionok="f" gradientshapeok="t" o:connecttype="rect"/>
                   <o:lock v:ext="edit" aspectratio="t"/>
                 </v:shapetype>
-                <v:shape id="_x0000_s1027" type="#_x0000_t75" alt="" style="position:absolute;margin-left:3.2pt;margin-top:6.75pt;width:54.15pt;height:70.4pt;z-index:-251649024;mso-wrap-edited:f;mso-width-percent:0;mso-height-percent:0;mso-position-horizontal-relative:text;mso-position-vertical-relative:text;mso-width-percent:0;mso-height-percent:0" wrapcoords="-470 -360 -470 21780 22070 21780 22070 -360 -470 -360" filled="t" fillcolor="#2e74b5 [2404]" stroked="t" strokecolor="#2e74b5 [2404]" strokeweight="1.25pt">
+                <v:shape id="_x0000_s2051" type="#_x0000_t75" alt="" style="position:absolute;margin-left:3.2pt;margin-top:6.75pt;width:54.15pt;height:70.4pt;z-index:-251649024;mso-wrap-edited:f;mso-width-percent:0;mso-height-percent:0;mso-position-horizontal-relative:text;mso-position-vertical-relative:text;mso-width-percent:0;mso-height-percent:0" wrapcoords="-470 -360 -470 21780 22070 21780 22070 -360 -470 -360" filled="t" fillcolor="#2e74b5 [2404]" stroked="t" strokecolor="#2e74b5 [2404]" strokeweight="1.25pt">
                   <v:imagedata r:id="rId24" o:title=""/>
                   <w10:wrap type="tight"/>
                 </v:shape>
-                <o:OLEObject Type="Embed" ProgID="Acrobat.Document.DC" ShapeID="_x0000_s1027" DrawAspect="Content" ObjectID="_1814730998" r:id="rId25"/>
+                <o:OLEObject Type="Embed" ProgID="Acrobat.Document.DC" ShapeID="_x0000_s2051" DrawAspect="Content" ObjectID="_1846088909" r:id="rId25"/>
               </w:object>
             </w:r>
           </w:p>
@@ -2142,12 +2118,12 @@
               <w:rPr>
                 <w:noProof/>
               </w:rPr>
-              <w:object w:dxaOrig="1440" w:dyaOrig="1440" w14:anchorId="0D497488">
-                <v:shape id="_x0000_s1026" type="#_x0000_t75" alt="" style="position:absolute;margin-left:3.2pt;margin-top:9.2pt;width:54.15pt;height:71.65pt;z-index:251668480;mso-wrap-edited:f;mso-width-percent:0;mso-height-percent:0;mso-position-horizontal-relative:text;mso-position-vertical-relative:text;mso-width-percent:0;mso-height-percent:0" wrapcoords="-475 -300 -475 21750 22075 21750 22075 -300 -475 -300" filled="t" fillcolor="#2e74b5 [2404]" stroked="t" strokecolor="#2e74b5 [2404]" strokeweight="1.5pt">
+              <w:object w:dxaOrig="0" w:dyaOrig="0" w14:anchorId="0D497488">
+                <v:shape id="_x0000_s2050" type="#_x0000_t75" alt="" style="position:absolute;margin-left:3.2pt;margin-top:9.2pt;width:54.15pt;height:71.65pt;z-index:251668480;mso-wrap-edited:f;mso-width-percent:0;mso-height-percent:0;mso-position-horizontal-relative:text;mso-position-vertical-relative:text;mso-width-percent:0;mso-height-percent:0" wrapcoords="-475 -300 -475 21750 22075 21750 22075 -300 -475 -300" filled="t" fillcolor="#2e74b5 [2404]" stroked="t" strokecolor="#2e74b5 [2404]" strokeweight="1.5pt">
                   <v:imagedata r:id="rId27" o:title=""/>
                   <w10:wrap type="tight"/>
                 </v:shape>
-                <o:OLEObject Type="Embed" ProgID="Acrobat.Document.DC" ShapeID="_x0000_s1026" DrawAspect="Content" ObjectID="_1814730999" r:id="rId28"/>
+                <o:OLEObject Type="Embed" ProgID="Acrobat.Document.DC" ShapeID="_x0000_s2050" DrawAspect="Content" ObjectID="_1846088910" r:id="rId28"/>
               </w:object>
             </w:r>
           </w:p>
@@ -2279,14 +2255,14 @@
                 <w:noProof/>
               </w:rPr>
               <w:object w:dxaOrig="9180" w:dyaOrig="11880" w14:anchorId="56084997">
-                <v:shape id="_x0000_i1027" type="#_x0000_t75" alt="" style="width:57pt;height:70.8pt;mso-width-percent:0;mso-height-percent:0;mso-width-percent:0;mso-height-percent:0" o:ole="" o:bordertopcolor="this" o:borderleftcolor="this" o:borderbottomcolor="this" o:borderrightcolor="this">
+                <v:shape id="_x0000_i1027" type="#_x0000_t75" alt="" style="width:57.05pt;height:70.8pt;mso-width-percent:0;mso-height-percent:0;mso-width-percent:0;mso-height-percent:0" o:ole="" o:bordertopcolor="this" o:borderleftcolor="this" o:borderbottomcolor="this" o:borderrightcolor="this">
                   <v:imagedata r:id="rId29" o:title=""/>
                   <w10:bordertop type="single" width="12"/>
                   <w10:borderleft type="single" width="12"/>
                   <w10:borderbottom type="single" width="12"/>
                   <w10:borderright type="single" width="12"/>
                 </v:shape>
-                <o:OLEObject Type="Embed" ProgID="Acrobat.Document.DC" ShapeID="_x0000_i1027" DrawAspect="Content" ObjectID="_1814730997" r:id="rId30"/>
+                <o:OLEObject Type="Embed" ProgID="Acrobat.Document.DC" ShapeID="_x0000_i1027" DrawAspect="Content" ObjectID="_1846088908" r:id="rId30"/>
               </w:object>
             </w:r>
           </w:p>
@@ -2946,17 +2922,8 @@
           <w:rFonts w:asciiTheme="minorHAnsi" w:hAnsiTheme="minorHAnsi" w:cstheme="minorHAnsi"/>
           <w:lang w:eastAsia="ja-JP"/>
         </w:rPr>
-        <w:t xml:space="preserve">a </w:t>
-      </w:r>
-      <w:proofErr w:type="gramStart"/>
-      <w:r>
-        <w:rPr>
-          <w:rFonts w:asciiTheme="minorHAnsi" w:hAnsiTheme="minorHAnsi" w:cstheme="minorHAnsi"/>
-          <w:lang w:eastAsia="ja-JP"/>
-        </w:rPr>
-        <w:t>mini-test</w:t>
-      </w:r>
-      <w:proofErr w:type="gramEnd"/>
+        <w:t>a mini-test</w:t>
+      </w:r>
       <w:r>
         <w:rPr>
           <w:rFonts w:asciiTheme="minorHAnsi" w:hAnsiTheme="minorHAnsi" w:cstheme="minorHAnsi"/>
@@ -4421,21 +4388,7 @@
         <w:rPr>
           <w:rFonts w:asciiTheme="minorHAnsi" w:hAnsiTheme="minorHAnsi" w:cstheme="minorHAnsi"/>
         </w:rPr>
-        <w:t xml:space="preserve">In a typical blockchain network there are many </w:t>
-      </w:r>
-      <w:proofErr w:type="gramStart"/>
-      <w:r>
-        <w:rPr>
-          <w:rFonts w:asciiTheme="minorHAnsi" w:hAnsiTheme="minorHAnsi" w:cstheme="minorHAnsi"/>
-        </w:rPr>
-        <w:t>nodes</w:t>
-      </w:r>
-      <w:proofErr w:type="gramEnd"/>
-      <w:r>
-        <w:rPr>
-          <w:rFonts w:asciiTheme="minorHAnsi" w:hAnsiTheme="minorHAnsi" w:cstheme="minorHAnsi"/>
-        </w:rPr>
-        <w:t xml:space="preserve"> and many transactions get verified at a time. Once the transaction is verified and declared a legitimate transaction, it will be added to the </w:t>
+        <w:t xml:space="preserve">In a typical blockchain network there are many nodes and many transactions get verified at a time. Once the transaction is verified and declared a legitimate transaction, it will be added to the </w:t>
       </w:r>
       <w:proofErr w:type="spellStart"/>
       <w:r>
@@ -4802,19 +4755,11 @@
         </w:rPr>
         <w:t>Step 3: Formation of a new block: </w:t>
       </w:r>
-      <w:proofErr w:type="gramStart"/>
-      <w:r>
-        <w:rPr>
-          <w:rFonts w:asciiTheme="minorHAnsi" w:hAnsiTheme="minorHAnsi" w:cstheme="minorHAnsi"/>
-        </w:rPr>
-        <w:t>A number of</w:t>
-      </w:r>
-      <w:proofErr w:type="gramEnd"/>
-      <w:r>
-        <w:rPr>
-          <w:rFonts w:asciiTheme="minorHAnsi" w:hAnsiTheme="minorHAnsi" w:cstheme="minorHAnsi"/>
-        </w:rPr>
-        <w:t xml:space="preserve"> verified transactions stack up in </w:t>
+      <w:r>
+        <w:rPr>
+          <w:rFonts w:asciiTheme="minorHAnsi" w:hAnsiTheme="minorHAnsi" w:cstheme="minorHAnsi"/>
+        </w:rPr>
+        <w:t xml:space="preserve">A number of verified transactions stack up in </w:t>
       </w:r>
       <w:proofErr w:type="spellStart"/>
       <w:r>
@@ -4886,21 +4831,7 @@
         <w:rPr>
           <w:rFonts w:asciiTheme="minorHAnsi" w:hAnsiTheme="minorHAnsi" w:cstheme="minorHAnsi"/>
         </w:rPr>
-        <w:t xml:space="preserve"> will be used for block verification. In proof-of-work, the system assigns the target hash value to a node, and according to this, it must come up with a hash for the new block. The node </w:t>
-      </w:r>
-      <w:proofErr w:type="gramStart"/>
-      <w:r>
-        <w:rPr>
-          <w:rFonts w:asciiTheme="minorHAnsi" w:hAnsiTheme="minorHAnsi" w:cstheme="minorHAnsi"/>
-        </w:rPr>
-        <w:t>has to</w:t>
-      </w:r>
-      <w:proofErr w:type="gramEnd"/>
-      <w:r>
-        <w:rPr>
-          <w:rFonts w:asciiTheme="minorHAnsi" w:hAnsiTheme="minorHAnsi" w:cstheme="minorHAnsi"/>
-        </w:rPr>
-        <w:t xml:space="preserve"> calculate the hash value for the new block that is less than the target value. If two or more miners mine the same block at the same time, the block with more difficulty is selected. The others are known as stale blocks. Mining usually rewards miners with blockchain currency. In this case, the blockchain currency is </w:t>
+        <w:t xml:space="preserve"> will be used for block verification. In proof-of-work, the system assigns the target hash value to a node, and according to this, it must come up with a hash for the new block. The node has to calculate the hash value for the new block that is less than the target value. If two or more miners mine the same block at the same time, the block with more difficulty is selected. The others are known as stale blocks. Mining usually rewards miners with blockchain currency. In this case, the blockchain currency is </w:t>
       </w:r>
       <w:r>
         <w:rPr>
@@ -5065,23 +4996,13 @@
           <w:szCs w:val="24"/>
         </w:rPr>
       </w:pPr>
-      <w:proofErr w:type="gramStart"/>
-      <w:r>
-        <w:rPr>
-          <w:rFonts w:cstheme="minorHAnsi"/>
-          <w:sz w:val="24"/>
-          <w:szCs w:val="24"/>
-        </w:rPr>
-        <w:t>Suppose,</w:t>
-      </w:r>
-      <w:proofErr w:type="gramEnd"/>
-      <w:r>
-        <w:rPr>
-          <w:rFonts w:cstheme="minorHAnsi"/>
-          <w:sz w:val="24"/>
-          <w:szCs w:val="24"/>
-        </w:rPr>
-        <w:t xml:space="preserve"> there is a chain of 10 blocks, where the 10</w:t>
+      <w:r>
+        <w:rPr>
+          <w:rFonts w:cstheme="minorHAnsi"/>
+          <w:sz w:val="24"/>
+          <w:szCs w:val="24"/>
+        </w:rPr>
+        <w:t>Suppose, there is a chain of 10 blocks, where the 10</w:t>
       </w:r>
       <w:r>
         <w:rPr>
@@ -5345,43 +5266,7 @@
           <w:sz w:val="24"/>
           <w:szCs w:val="24"/>
         </w:rPr>
-        <w:t xml:space="preserve">Also, to add/change a block in a blockchain, a consensus algorithm is used by nodes in the blockchain network. </w:t>
-      </w:r>
-      <w:proofErr w:type="gramStart"/>
-      <w:r>
-        <w:rPr>
-          <w:rFonts w:cstheme="minorHAnsi"/>
-          <w:sz w:val="24"/>
-          <w:szCs w:val="24"/>
-        </w:rPr>
-        <w:t>In order to</w:t>
-      </w:r>
-      <w:proofErr w:type="gramEnd"/>
-      <w:r>
-        <w:rPr>
-          <w:rFonts w:cstheme="minorHAnsi"/>
-          <w:sz w:val="24"/>
-          <w:szCs w:val="24"/>
-        </w:rPr>
-        <w:t xml:space="preserve"> compensate for the change in one block, one </w:t>
-      </w:r>
-      <w:proofErr w:type="gramStart"/>
-      <w:r>
-        <w:rPr>
-          <w:rFonts w:cstheme="minorHAnsi"/>
-          <w:sz w:val="24"/>
-          <w:szCs w:val="24"/>
-        </w:rPr>
-        <w:t>must have to</w:t>
-      </w:r>
-      <w:proofErr w:type="gramEnd"/>
-      <w:r>
-        <w:rPr>
-          <w:rFonts w:cstheme="minorHAnsi"/>
-          <w:sz w:val="24"/>
-          <w:szCs w:val="24"/>
-        </w:rPr>
-        <w:t xml:space="preserve"> recalculate the hash of every block to update the hash value of the block header in the next block. This will involve a lot of time and computational resources.</w:t>
+        <w:t>Also, to add/change a block in a blockchain, a consensus algorithm is used by nodes in the blockchain network. In order to compensate for the change in one block, one must have to recalculate the hash of every block to update the hash value of the block header in the next block. This will involve a lot of time and computational resources.</w:t>
       </w:r>
     </w:p>
     <w:p>
@@ -5403,41 +5288,13 @@
           <w:szCs w:val="24"/>
         </w:rPr>
       </w:pPr>
-      <w:proofErr w:type="gramStart"/>
-      <w:r>
-        <w:rPr>
-          <w:rFonts w:cstheme="minorHAnsi"/>
-          <w:sz w:val="24"/>
-          <w:szCs w:val="24"/>
-        </w:rPr>
-        <w:t>In order to</w:t>
-      </w:r>
-      <w:proofErr w:type="gramEnd"/>
-      <w:r>
-        <w:rPr>
-          <w:rFonts w:cstheme="minorHAnsi"/>
-          <w:sz w:val="24"/>
-          <w:szCs w:val="24"/>
-        </w:rPr>
-        <w:t xml:space="preserve"> succeed with such kind of attack, the hacker </w:t>
-      </w:r>
-      <w:proofErr w:type="gramStart"/>
-      <w:r>
-        <w:rPr>
-          <w:rFonts w:cstheme="minorHAnsi"/>
-          <w:sz w:val="24"/>
-          <w:szCs w:val="24"/>
-        </w:rPr>
-        <w:t>has to</w:t>
-      </w:r>
-      <w:proofErr w:type="gramEnd"/>
-      <w:r>
-        <w:rPr>
-          <w:rFonts w:cstheme="minorHAnsi"/>
-          <w:sz w:val="24"/>
-          <w:szCs w:val="24"/>
-        </w:rPr>
-        <w:t xml:space="preserve"> simultaneously control and change 51% or more copies of the blockchain so that their new copy becomes the majority copy and thus the agreed-upon chain. </w:t>
+      <w:r>
+        <w:rPr>
+          <w:rFonts w:cstheme="minorHAnsi"/>
+          <w:sz w:val="24"/>
+          <w:szCs w:val="24"/>
+        </w:rPr>
+        <w:t>In order to succeed with such kind of attack, the hacker has to simultaneously control and change 51% or more copies of the blockchain so that their new copy becomes the majority copy and thus the agreed-upon chain. </w:t>
       </w:r>
     </w:p>
     <w:p>
@@ -5960,21 +5817,7 @@
         <w:rPr>
           <w:rFonts w:asciiTheme="minorHAnsi" w:hAnsiTheme="minorHAnsi" w:cstheme="minorHAnsi"/>
         </w:rPr>
-        <w:t xml:space="preserve"> a </w:t>
-      </w:r>
-      <w:proofErr w:type="gramStart"/>
-      <w:r>
-        <w:rPr>
-          <w:rFonts w:asciiTheme="minorHAnsi" w:hAnsiTheme="minorHAnsi" w:cstheme="minorHAnsi"/>
-        </w:rPr>
-        <w:t>crypto-currency</w:t>
-      </w:r>
-      <w:proofErr w:type="gramEnd"/>
-      <w:r>
-        <w:rPr>
-          <w:rFonts w:asciiTheme="minorHAnsi" w:hAnsiTheme="minorHAnsi" w:cstheme="minorHAnsi"/>
-        </w:rPr>
-        <w:t xml:space="preserve"> (a kind of digital currency), mainly created to simplify a transaction without having third-party intermediaries. It all started when this mysterious man under the name of</w:t>
+        <w:t xml:space="preserve"> a crypto-currency (a kind of digital currency), mainly created to simplify a transaction without having third-party intermediaries. It all started when this mysterious man under the name of</w:t>
       </w:r>
       <w:r>
         <w:rPr>
@@ -6088,21 +5931,7 @@
         <w:rPr>
           <w:rFonts w:asciiTheme="minorHAnsi" w:hAnsiTheme="minorHAnsi" w:cstheme="minorHAnsi"/>
         </w:rPr>
-        <w:t xml:space="preserve">s are not issued by any centralized banks or authorities. They are ‘mined’ by a group of people </w:t>
-      </w:r>
-      <w:proofErr w:type="gramStart"/>
-      <w:r>
-        <w:rPr>
-          <w:rFonts w:asciiTheme="minorHAnsi" w:hAnsiTheme="minorHAnsi" w:cstheme="minorHAnsi"/>
-        </w:rPr>
-        <w:t>called as ‘miners’</w:t>
-      </w:r>
-      <w:proofErr w:type="gramEnd"/>
-      <w:r>
-        <w:rPr>
-          <w:rFonts w:asciiTheme="minorHAnsi" w:hAnsiTheme="minorHAnsi" w:cstheme="minorHAnsi"/>
-        </w:rPr>
-        <w:t xml:space="preserve">. They solve complex mathematical problems/puzzles and are issued a certain number of </w:t>
+        <w:t xml:space="preserve">s are not issued by any centralized banks or authorities. They are ‘mined’ by a group of people called as ‘miners’. They solve complex mathematical problems/puzzles and are issued a certain number of </w:t>
       </w:r>
       <w:r>
         <w:rPr>
@@ -7943,18 +7772,6 @@
       <w:pStyle w:val="Footer"/>
       <w:jc w:val="both"/>
     </w:pPr>
-    <w:r>
-      <w:rPr>
-        <w:rFonts w:cs="Times New Roman" w:hint="eastAsia"/>
-        <w:i/>
-        <w:noProof/>
-        <w:color w:val="000000"/>
-        <w:spacing w:val="-3"/>
-        <w:sz w:val="20"/>
-        <w:lang w:eastAsia="ko-KR"/>
-      </w:rPr>
-      <w:t>KAIST - PMBA</w:t>
-    </w:r>
     <w:r>
       <w:rPr>
         <w:rFonts w:cs="Times New Roman"/>

</xml_diff>